<commit_message>
Working on updates to workshop 1 and 2
Created workshop_coversheet.tex and workshop_rubric.tex for creating a workshop booklet.  The rubric can be placed at multiple points in the workshop booklet to be used for marking.

*Updates*
- the week 1 workshop
- timelineactivities and
- presentation

Created elevfield.py for use with week 1 gradient and laplacian calculations.

Started week 2 workshop update.
</commit_message>
<xml_diff>
--- a/week_1_fields/assignment/week1_answer_sheet.docx
+++ b/week_1_fields/assignment/week1_answer_sheet.docx
@@ -11,7 +11,7 @@
           <w:noProof/>
         </w:rPr>
         <w:drawing>
-          <wp:inline distT="0" distB="0" distL="0" distR="0" wp14:anchorId="4A2915B2" wp14:editId="32D38CF0">
+          <wp:inline distT="0" distB="0" distL="0" distR="0" wp14:anchorId="4A2915B2" wp14:editId="1BABFEA1">
             <wp:extent cx="2778369" cy="663425"/>
             <wp:effectExtent l="0" t="0" r="3175" b="0"/>
             <wp:docPr id="718134854" name="Picture 1"/>
@@ -84,32 +84,52 @@
         <w:rPr>
           <w:b/>
           <w:bCs/>
-          <w:color w:val="C00000"/>
+          <w:color w:val="836BFF"/>
           <w:sz w:val="32"/>
           <w:szCs w:val="32"/>
         </w:rPr>
-        <w:t>[N]</w:t>
+        <w:t>1</w:t>
       </w:r>
       <w:r>
         <w:rPr>
           <w:b/>
           <w:bCs/>
-          <w:color w:val="C00000"/>
+          <w:color w:val="836BFF"/>
           <w:sz w:val="32"/>
           <w:szCs w:val="32"/>
         </w:rPr>
         <w:t xml:space="preserve">: </w:t>
+      </w:r>
+      <w:r>
+        <w:rPr>
+          <w:b/>
+          <w:bCs/>
+          <w:color w:val="836BFF"/>
+          <w:sz w:val="32"/>
+          <w:szCs w:val="32"/>
+        </w:rPr>
+        <w:t xml:space="preserve">Elevation as a Potential </w:t>
       </w:r>
       <w:proofErr w:type="gramStart"/>
       <w:r>
         <w:rPr>
           <w:b/>
           <w:bCs/>
-          <w:color w:val="C00000"/>
+          <w:color w:val="836BFF"/>
           <w:sz w:val="32"/>
           <w:szCs w:val="32"/>
         </w:rPr>
-        <w:t>Title</w:t>
+        <w:t>Field</w:t>
+      </w:r>
+      <w:r>
+        <w:rPr>
+          <w:b/>
+          <w:bCs/>
+          <w:color w:val="7030A0"/>
+          <w:sz w:val="32"/>
+          <w:szCs w:val="32"/>
+        </w:rPr>
+        <w:t xml:space="preserve">  </w:t>
       </w:r>
       <w:r>
         <w:rPr>
@@ -118,7 +138,7 @@
           <w:sz w:val="32"/>
           <w:szCs w:val="32"/>
         </w:rPr>
-        <w:t xml:space="preserve">  —</w:t>
+        <w:t>—</w:t>
       </w:r>
       <w:proofErr w:type="gramEnd"/>
       <w:r>
@@ -155,12 +175,6 @@
         <w:gridCol w:w="2695"/>
       </w:tblGrid>
       <w:tr>
-        <w:tblPrEx>
-          <w:tblCellMar>
-            <w:top w:w="0" w:type="dxa"/>
-            <w:bottom w:w="0" w:type="dxa"/>
-          </w:tblCellMar>
-        </w:tblPrEx>
         <w:tc>
           <w:tcPr>
             <w:tcW w:w="1345" w:type="dxa"/>
@@ -394,6 +408,20 @@
         <w:t>Answers</w:t>
       </w:r>
     </w:p>
+    <w:p>
+      <w:pPr>
+        <w:pStyle w:val="Heading2"/>
+        <w:rPr>
+          <w:color w:val="130E50"/>
+        </w:rPr>
+      </w:pPr>
+      <w:r>
+        <w:rPr>
+          <w:color w:val="130E50"/>
+        </w:rPr>
+        <w:t>Gradient Activity</w:t>
+      </w:r>
+    </w:p>
     <w:tbl>
       <w:tblPr>
         <w:tblW w:w="5000" w:type="pct"/>
@@ -416,18 +444,12 @@
         <w:gridCol w:w="8715"/>
       </w:tblGrid>
       <w:tr>
-        <w:tblPrEx>
-          <w:tblCellMar>
-            <w:top w:w="0" w:type="dxa"/>
-            <w:bottom w:w="0" w:type="dxa"/>
-          </w:tblCellMar>
-        </w:tblPrEx>
         <w:trPr>
           <w:tblHeader/>
         </w:trPr>
         <w:tc>
           <w:tcPr>
-            <w:tcW w:w="1800" w:type="dxa"/>
+            <w:tcW w:w="2075" w:type="dxa"/>
             <w:tcBorders>
               <w:top w:val="single" w:sz="4" w:space="0" w:color="BFBFBF"/>
               <w:left w:val="single" w:sz="4" w:space="0" w:color="BFBFBF"/>
@@ -456,7 +478,7 @@
         </w:tc>
         <w:tc>
           <w:tcPr>
-            <w:tcW w:w="7560" w:type="dxa"/>
+            <w:tcW w:w="8715" w:type="dxa"/>
             <w:tcBorders>
               <w:top w:val="single" w:sz="4" w:space="0" w:color="BFBFBF"/>
               <w:left w:val="single" w:sz="4" w:space="0" w:color="BFBFBF"/>
@@ -485,15 +507,9 @@
         </w:tc>
       </w:tr>
       <w:tr>
-        <w:tblPrEx>
-          <w:tblCellMar>
-            <w:top w:w="0" w:type="dxa"/>
-            <w:bottom w:w="0" w:type="dxa"/>
-          </w:tblCellMar>
-        </w:tblPrEx>
-        <w:tc>
-          <w:tcPr>
-            <w:tcW w:w="1800" w:type="dxa"/>
+        <w:tc>
+          <w:tcPr>
+            <w:tcW w:w="2075" w:type="dxa"/>
             <w:tcBorders>
               <w:top w:val="single" w:sz="4" w:space="0" w:color="BFBFBF"/>
               <w:left w:val="single" w:sz="4" w:space="0" w:color="BFBFBF"/>
@@ -513,13 +529,22 @@
                 <w:b/>
                 <w:bCs/>
               </w:rPr>
-              <w:t>Q1.1</w:t>
-            </w:r>
+              <w:t>Q</w:t>
+            </w:r>
+            <w:proofErr w:type="gramStart"/>
+            <w:r>
+              <w:rPr>
+                <w:b/>
+                <w:bCs/>
+              </w:rPr>
+              <w:t>1.a</w:t>
+            </w:r>
+            <w:proofErr w:type="gramEnd"/>
           </w:p>
         </w:tc>
         <w:tc>
           <w:tcPr>
-            <w:tcW w:w="7560" w:type="dxa"/>
+            <w:tcW w:w="8715" w:type="dxa"/>
             <w:tcBorders>
               <w:top w:val="single" w:sz="4" w:space="0" w:color="BFBFBF"/>
               <w:left w:val="single" w:sz="4" w:space="0" w:color="BFBFBF"/>
@@ -539,15 +564,9 @@
         </w:tc>
       </w:tr>
       <w:tr>
-        <w:tblPrEx>
-          <w:tblCellMar>
-            <w:top w:w="0" w:type="dxa"/>
-            <w:bottom w:w="0" w:type="dxa"/>
-          </w:tblCellMar>
-        </w:tblPrEx>
-        <w:tc>
-          <w:tcPr>
-            <w:tcW w:w="1800" w:type="dxa"/>
+        <w:tc>
+          <w:tcPr>
+            <w:tcW w:w="2075" w:type="dxa"/>
             <w:tcBorders>
               <w:top w:val="single" w:sz="4" w:space="0" w:color="BFBFBF"/>
               <w:left w:val="single" w:sz="4" w:space="0" w:color="BFBFBF"/>
@@ -567,13 +586,22 @@
                 <w:b/>
                 <w:bCs/>
               </w:rPr>
-              <w:t>Q1.2</w:t>
-            </w:r>
+              <w:t>Q</w:t>
+            </w:r>
+            <w:proofErr w:type="gramStart"/>
+            <w:r>
+              <w:rPr>
+                <w:b/>
+                <w:bCs/>
+              </w:rPr>
+              <w:t>1.b</w:t>
+            </w:r>
+            <w:proofErr w:type="gramEnd"/>
           </w:p>
         </w:tc>
         <w:tc>
           <w:tcPr>
-            <w:tcW w:w="7560" w:type="dxa"/>
+            <w:tcW w:w="8715" w:type="dxa"/>
             <w:tcBorders>
               <w:top w:val="single" w:sz="4" w:space="0" w:color="BFBFBF"/>
               <w:left w:val="single" w:sz="4" w:space="0" w:color="BFBFBF"/>
@@ -593,15 +621,9 @@
         </w:tc>
       </w:tr>
       <w:tr>
-        <w:tblPrEx>
-          <w:tblCellMar>
-            <w:top w:w="0" w:type="dxa"/>
-            <w:bottom w:w="0" w:type="dxa"/>
-          </w:tblCellMar>
-        </w:tblPrEx>
-        <w:tc>
-          <w:tcPr>
-            <w:tcW w:w="1800" w:type="dxa"/>
+        <w:tc>
+          <w:tcPr>
+            <w:tcW w:w="2075" w:type="dxa"/>
             <w:tcBorders>
               <w:top w:val="single" w:sz="4" w:space="0" w:color="BFBFBF"/>
               <w:left w:val="single" w:sz="4" w:space="0" w:color="BFBFBF"/>
@@ -621,13 +643,13 @@
                 <w:b/>
                 <w:bCs/>
               </w:rPr>
-              <w:t>Q1.3</w:t>
+              <w:t>Q1.c</w:t>
             </w:r>
           </w:p>
         </w:tc>
         <w:tc>
           <w:tcPr>
-            <w:tcW w:w="7560" w:type="dxa"/>
+            <w:tcW w:w="8715" w:type="dxa"/>
             <w:tcBorders>
               <w:top w:val="single" w:sz="4" w:space="0" w:color="BFBFBF"/>
               <w:left w:val="single" w:sz="4" w:space="0" w:color="BFBFBF"/>
@@ -647,15 +669,9 @@
         </w:tc>
       </w:tr>
       <w:tr>
-        <w:tblPrEx>
-          <w:tblCellMar>
-            <w:top w:w="0" w:type="dxa"/>
-            <w:bottom w:w="0" w:type="dxa"/>
-          </w:tblCellMar>
-        </w:tblPrEx>
-        <w:tc>
-          <w:tcPr>
-            <w:tcW w:w="1800" w:type="dxa"/>
+        <w:tc>
+          <w:tcPr>
+            <w:tcW w:w="2075" w:type="dxa"/>
             <w:tcBorders>
               <w:top w:val="single" w:sz="4" w:space="0" w:color="BFBFBF"/>
               <w:left w:val="single" w:sz="4" w:space="0" w:color="BFBFBF"/>
@@ -670,46 +686,60 @@
             </w:tcMar>
           </w:tcPr>
           <w:p>
-            <w:r>
-              <w:rPr>
-                <w:b/>
-                <w:bCs/>
-              </w:rPr>
-              <w:t>Q1.4</w:t>
+            <w:pPr>
+              <w:rPr>
+                <w:b/>
+                <w:bCs/>
+              </w:rPr>
+            </w:pPr>
+            <w:r>
+              <w:rPr>
+                <w:b/>
+                <w:bCs/>
+              </w:rPr>
+              <w:t>Q1.d</w:t>
             </w:r>
           </w:p>
-        </w:tc>
-        <w:tc>
-          <w:tcPr>
-            <w:tcW w:w="7560" w:type="dxa"/>
-            <w:tcBorders>
-              <w:top w:val="single" w:sz="4" w:space="0" w:color="BFBFBF"/>
-              <w:left w:val="single" w:sz="4" w:space="0" w:color="BFBFBF"/>
-              <w:bottom w:val="single" w:sz="4" w:space="0" w:color="BFBFBF"/>
-              <w:right w:val="single" w:sz="4" w:space="0" w:color="BFBFBF"/>
-            </w:tcBorders>
-            <w:tcMar>
-              <w:top w:w="100" w:type="dxa"/>
-              <w:left w:w="140" w:type="dxa"/>
-              <w:bottom w:w="100" w:type="dxa"/>
-              <w:right w:w="140" w:type="dxa"/>
-            </w:tcMar>
-          </w:tcPr>
-          <w:p/>
-          <w:p/>
+          <w:p>
+            <w:pPr>
+              <w:rPr>
+                <w:b/>
+                <w:bCs/>
+              </w:rPr>
+            </w:pPr>
+          </w:p>
+          <w:p>
+            <w:pPr>
+              <w:rPr>
+                <w:b/>
+                <w:bCs/>
+              </w:rPr>
+            </w:pPr>
+          </w:p>
+        </w:tc>
+        <w:tc>
+          <w:tcPr>
+            <w:tcW w:w="8715" w:type="dxa"/>
+            <w:tcBorders>
+              <w:top w:val="single" w:sz="4" w:space="0" w:color="BFBFBF"/>
+              <w:left w:val="single" w:sz="4" w:space="0" w:color="BFBFBF"/>
+              <w:bottom w:val="single" w:sz="4" w:space="0" w:color="BFBFBF"/>
+              <w:right w:val="single" w:sz="4" w:space="0" w:color="BFBFBF"/>
+            </w:tcBorders>
+            <w:tcMar>
+              <w:top w:w="100" w:type="dxa"/>
+              <w:left w:w="140" w:type="dxa"/>
+              <w:bottom w:w="100" w:type="dxa"/>
+              <w:right w:w="140" w:type="dxa"/>
+            </w:tcMar>
+          </w:tcPr>
           <w:p/>
         </w:tc>
       </w:tr>
       <w:tr>
-        <w:tblPrEx>
-          <w:tblCellMar>
-            <w:top w:w="0" w:type="dxa"/>
-            <w:bottom w:w="0" w:type="dxa"/>
-          </w:tblCellMar>
-        </w:tblPrEx>
-        <w:tc>
-          <w:tcPr>
-            <w:tcW w:w="1800" w:type="dxa"/>
+        <w:tc>
+          <w:tcPr>
+            <w:tcW w:w="2075" w:type="dxa"/>
             <w:tcBorders>
               <w:top w:val="single" w:sz="4" w:space="0" w:color="BFBFBF"/>
               <w:left w:val="single" w:sz="4" w:space="0" w:color="BFBFBF"/>
@@ -729,13 +759,23 @@
                 <w:b/>
                 <w:bCs/>
               </w:rPr>
-              <w:t>Q1.5</w:t>
-            </w:r>
+              <w:lastRenderedPageBreak/>
+              <w:t>Q</w:t>
+            </w:r>
+            <w:proofErr w:type="gramStart"/>
+            <w:r>
+              <w:rPr>
+                <w:b/>
+                <w:bCs/>
+              </w:rPr>
+              <w:t>2.a</w:t>
+            </w:r>
+            <w:proofErr w:type="gramEnd"/>
           </w:p>
         </w:tc>
         <w:tc>
           <w:tcPr>
-            <w:tcW w:w="7560" w:type="dxa"/>
+            <w:tcW w:w="8715" w:type="dxa"/>
             <w:tcBorders>
               <w:top w:val="single" w:sz="4" w:space="0" w:color="BFBFBF"/>
               <w:left w:val="single" w:sz="4" w:space="0" w:color="BFBFBF"/>
@@ -755,12 +795,232 @@
         </w:tc>
       </w:tr>
       <w:tr>
-        <w:tblPrEx>
-          <w:tblCellMar>
-            <w:top w:w="0" w:type="dxa"/>
-            <w:bottom w:w="0" w:type="dxa"/>
-          </w:tblCellMar>
-        </w:tblPrEx>
+        <w:tc>
+          <w:tcPr>
+            <w:tcW w:w="2075" w:type="dxa"/>
+            <w:tcBorders>
+              <w:top w:val="single" w:sz="4" w:space="0" w:color="BFBFBF"/>
+              <w:left w:val="single" w:sz="4" w:space="0" w:color="BFBFBF"/>
+              <w:bottom w:val="single" w:sz="4" w:space="0" w:color="BFBFBF"/>
+              <w:right w:val="single" w:sz="4" w:space="0" w:color="BFBFBF"/>
+            </w:tcBorders>
+            <w:tcMar>
+              <w:top w:w="100" w:type="dxa"/>
+              <w:left w:w="140" w:type="dxa"/>
+              <w:bottom w:w="100" w:type="dxa"/>
+              <w:right w:w="140" w:type="dxa"/>
+            </w:tcMar>
+          </w:tcPr>
+          <w:p>
+            <w:r>
+              <w:rPr>
+                <w:b/>
+                <w:bCs/>
+              </w:rPr>
+              <w:t>Q</w:t>
+            </w:r>
+            <w:proofErr w:type="gramStart"/>
+            <w:r>
+              <w:rPr>
+                <w:b/>
+                <w:bCs/>
+              </w:rPr>
+              <w:t>2.b</w:t>
+            </w:r>
+            <w:proofErr w:type="gramEnd"/>
+          </w:p>
+        </w:tc>
+        <w:tc>
+          <w:tcPr>
+            <w:tcW w:w="8715" w:type="dxa"/>
+            <w:tcBorders>
+              <w:top w:val="single" w:sz="4" w:space="0" w:color="BFBFBF"/>
+              <w:left w:val="single" w:sz="4" w:space="0" w:color="BFBFBF"/>
+              <w:bottom w:val="single" w:sz="4" w:space="0" w:color="BFBFBF"/>
+              <w:right w:val="single" w:sz="4" w:space="0" w:color="BFBFBF"/>
+            </w:tcBorders>
+            <w:tcMar>
+              <w:top w:w="100" w:type="dxa"/>
+              <w:left w:w="140" w:type="dxa"/>
+              <w:bottom w:w="100" w:type="dxa"/>
+              <w:right w:w="140" w:type="dxa"/>
+            </w:tcMar>
+          </w:tcPr>
+          <w:p/>
+          <w:p/>
+          <w:p/>
+        </w:tc>
+      </w:tr>
+      <w:tr>
+        <w:tc>
+          <w:tcPr>
+            <w:tcW w:w="2075" w:type="dxa"/>
+            <w:tcBorders>
+              <w:top w:val="single" w:sz="4" w:space="0" w:color="BFBFBF"/>
+              <w:left w:val="single" w:sz="4" w:space="0" w:color="BFBFBF"/>
+              <w:bottom w:val="single" w:sz="4" w:space="0" w:color="BFBFBF"/>
+              <w:right w:val="single" w:sz="4" w:space="0" w:color="BFBFBF"/>
+            </w:tcBorders>
+            <w:tcMar>
+              <w:top w:w="100" w:type="dxa"/>
+              <w:left w:w="140" w:type="dxa"/>
+              <w:bottom w:w="100" w:type="dxa"/>
+              <w:right w:w="140" w:type="dxa"/>
+            </w:tcMar>
+          </w:tcPr>
+          <w:p>
+            <w:pPr>
+              <w:rPr>
+                <w:b/>
+                <w:bCs/>
+              </w:rPr>
+            </w:pPr>
+            <w:r>
+              <w:rPr>
+                <w:b/>
+                <w:bCs/>
+              </w:rPr>
+              <w:t>Q2.c</w:t>
+            </w:r>
+          </w:p>
+        </w:tc>
+        <w:tc>
+          <w:tcPr>
+            <w:tcW w:w="8715" w:type="dxa"/>
+            <w:tcBorders>
+              <w:top w:val="single" w:sz="4" w:space="0" w:color="BFBFBF"/>
+              <w:left w:val="single" w:sz="4" w:space="0" w:color="BFBFBF"/>
+              <w:bottom w:val="single" w:sz="4" w:space="0" w:color="BFBFBF"/>
+              <w:right w:val="single" w:sz="4" w:space="0" w:color="BFBFBF"/>
+            </w:tcBorders>
+            <w:tcMar>
+              <w:top w:w="100" w:type="dxa"/>
+              <w:left w:w="140" w:type="dxa"/>
+              <w:bottom w:w="100" w:type="dxa"/>
+              <w:right w:w="140" w:type="dxa"/>
+            </w:tcMar>
+          </w:tcPr>
+          <w:p/>
+          <w:p/>
+          <w:p/>
+        </w:tc>
+      </w:tr>
+      <w:tr>
+        <w:tc>
+          <w:tcPr>
+            <w:tcW w:w="2075" w:type="dxa"/>
+            <w:tcBorders>
+              <w:top w:val="single" w:sz="4" w:space="0" w:color="BFBFBF"/>
+              <w:left w:val="single" w:sz="4" w:space="0" w:color="BFBFBF"/>
+              <w:bottom w:val="single" w:sz="4" w:space="0" w:color="BFBFBF"/>
+              <w:right w:val="single" w:sz="4" w:space="0" w:color="BFBFBF"/>
+            </w:tcBorders>
+            <w:tcMar>
+              <w:top w:w="100" w:type="dxa"/>
+              <w:left w:w="140" w:type="dxa"/>
+              <w:bottom w:w="100" w:type="dxa"/>
+              <w:right w:w="140" w:type="dxa"/>
+            </w:tcMar>
+          </w:tcPr>
+          <w:p>
+            <w:pPr>
+              <w:rPr>
+                <w:b/>
+                <w:bCs/>
+              </w:rPr>
+            </w:pPr>
+            <w:r>
+              <w:rPr>
+                <w:b/>
+                <w:bCs/>
+              </w:rPr>
+              <w:t>Q2.d</w:t>
+            </w:r>
+          </w:p>
+          <w:p>
+            <w:pPr>
+              <w:rPr>
+                <w:b/>
+                <w:bCs/>
+              </w:rPr>
+            </w:pPr>
+          </w:p>
+          <w:p>
+            <w:pPr>
+              <w:rPr>
+                <w:b/>
+                <w:bCs/>
+              </w:rPr>
+            </w:pPr>
+          </w:p>
+        </w:tc>
+        <w:tc>
+          <w:tcPr>
+            <w:tcW w:w="8715" w:type="dxa"/>
+            <w:tcBorders>
+              <w:top w:val="single" w:sz="4" w:space="0" w:color="BFBFBF"/>
+              <w:left w:val="single" w:sz="4" w:space="0" w:color="BFBFBF"/>
+              <w:bottom w:val="single" w:sz="4" w:space="0" w:color="BFBFBF"/>
+              <w:right w:val="single" w:sz="4" w:space="0" w:color="BFBFBF"/>
+            </w:tcBorders>
+            <w:tcMar>
+              <w:top w:w="100" w:type="dxa"/>
+              <w:left w:w="140" w:type="dxa"/>
+              <w:bottom w:w="100" w:type="dxa"/>
+              <w:right w:w="140" w:type="dxa"/>
+            </w:tcMar>
+          </w:tcPr>
+          <w:p/>
+        </w:tc>
+      </w:tr>
+    </w:tbl>
+    <w:p>
+      <w:pPr>
+        <w:pStyle w:val="Heading2"/>
+        <w:rPr>
+          <w:color w:val="130E50"/>
+        </w:rPr>
+      </w:pPr>
+    </w:p>
+    <w:p>
+      <w:pPr>
+        <w:pStyle w:val="Heading2"/>
+        <w:rPr>
+          <w:color w:val="130E50"/>
+        </w:rPr>
+      </w:pPr>
+      <w:r>
+        <w:rPr>
+          <w:color w:val="130E50"/>
+        </w:rPr>
+        <w:t>Problem Set</w:t>
+      </w:r>
+    </w:p>
+    <w:tbl>
+      <w:tblPr>
+        <w:tblW w:w="5000" w:type="pct"/>
+        <w:tblBorders>
+          <w:top w:val="single" w:sz="4" w:space="0" w:color="auto"/>
+          <w:left w:val="single" w:sz="4" w:space="0" w:color="auto"/>
+          <w:bottom w:val="single" w:sz="4" w:space="0" w:color="auto"/>
+          <w:right w:val="single" w:sz="4" w:space="0" w:color="auto"/>
+          <w:insideH w:val="single" w:sz="4" w:space="0" w:color="auto"/>
+          <w:insideV w:val="single" w:sz="4" w:space="0" w:color="auto"/>
+        </w:tblBorders>
+        <w:tblCellMar>
+          <w:left w:w="10" w:type="dxa"/>
+          <w:right w:w="10" w:type="dxa"/>
+        </w:tblCellMar>
+        <w:tblLook w:val="04A0" w:firstRow="1" w:lastRow="0" w:firstColumn="1" w:lastColumn="0" w:noHBand="0" w:noVBand="1"/>
+      </w:tblPr>
+      <w:tblGrid>
+        <w:gridCol w:w="2075"/>
+        <w:gridCol w:w="8715"/>
+      </w:tblGrid>
+      <w:tr>
+        <w:trPr>
+          <w:tblHeader/>
+        </w:trPr>
         <w:tc>
           <w:tcPr>
             <w:tcW w:w="1800" w:type="dxa"/>
@@ -770,21 +1030,384 @@
               <w:bottom w:val="single" w:sz="4" w:space="0" w:color="BFBFBF"/>
               <w:right w:val="single" w:sz="4" w:space="0" w:color="BFBFBF"/>
             </w:tcBorders>
-            <w:tcMar>
-              <w:top w:w="100" w:type="dxa"/>
-              <w:left w:w="140" w:type="dxa"/>
-              <w:bottom w:w="100" w:type="dxa"/>
-              <w:right w:w="140" w:type="dxa"/>
-            </w:tcMar>
+            <w:shd w:val="clear" w:color="auto" w:fill="130E50"/>
+            <w:tcMar>
+              <w:top w:w="100" w:type="dxa"/>
+              <w:left w:w="140" w:type="dxa"/>
+              <w:bottom w:w="100" w:type="dxa"/>
+              <w:right w:w="140" w:type="dxa"/>
+            </w:tcMar>
+            <w:vAlign w:val="center"/>
           </w:tcPr>
           <w:p>
             <w:r>
               <w:rPr>
                 <w:b/>
                 <w:bCs/>
-              </w:rPr>
-              <w:lastRenderedPageBreak/>
-              <w:t>Q1.6</w:t>
+                <w:color w:val="FFFFFF"/>
+              </w:rPr>
+              <w:t>Question</w:t>
+            </w:r>
+          </w:p>
+        </w:tc>
+        <w:tc>
+          <w:tcPr>
+            <w:tcW w:w="7560" w:type="dxa"/>
+            <w:tcBorders>
+              <w:top w:val="single" w:sz="4" w:space="0" w:color="BFBFBF"/>
+              <w:left w:val="single" w:sz="4" w:space="0" w:color="BFBFBF"/>
+              <w:bottom w:val="single" w:sz="4" w:space="0" w:color="BFBFBF"/>
+              <w:right w:val="single" w:sz="4" w:space="0" w:color="BFBFBF"/>
+            </w:tcBorders>
+            <w:shd w:val="clear" w:color="auto" w:fill="130E50"/>
+            <w:tcMar>
+              <w:top w:w="100" w:type="dxa"/>
+              <w:left w:w="140" w:type="dxa"/>
+              <w:bottom w:w="100" w:type="dxa"/>
+              <w:right w:w="140" w:type="dxa"/>
+            </w:tcMar>
+            <w:vAlign w:val="center"/>
+          </w:tcPr>
+          <w:p>
+            <w:r>
+              <w:rPr>
+                <w:b/>
+                <w:bCs/>
+                <w:color w:val="FFFFFF"/>
+              </w:rPr>
+              <w:t>Answer</w:t>
+            </w:r>
+          </w:p>
+        </w:tc>
+      </w:tr>
+      <w:tr>
+        <w:tc>
+          <w:tcPr>
+            <w:tcW w:w="1800" w:type="dxa"/>
+            <w:tcBorders>
+              <w:top w:val="single" w:sz="4" w:space="0" w:color="BFBFBF"/>
+              <w:left w:val="single" w:sz="4" w:space="0" w:color="BFBFBF"/>
+              <w:bottom w:val="single" w:sz="4" w:space="0" w:color="BFBFBF"/>
+              <w:right w:val="single" w:sz="4" w:space="0" w:color="BFBFBF"/>
+            </w:tcBorders>
+            <w:tcMar>
+              <w:top w:w="100" w:type="dxa"/>
+              <w:left w:w="140" w:type="dxa"/>
+              <w:bottom w:w="100" w:type="dxa"/>
+              <w:right w:w="140" w:type="dxa"/>
+            </w:tcMar>
+          </w:tcPr>
+          <w:p>
+            <w:r>
+              <w:rPr>
+                <w:b/>
+                <w:bCs/>
+              </w:rPr>
+              <w:t>Q</w:t>
+            </w:r>
+            <w:proofErr w:type="gramStart"/>
+            <w:r>
+              <w:rPr>
+                <w:b/>
+                <w:bCs/>
+              </w:rPr>
+              <w:t>1.</w:t>
+            </w:r>
+            <w:r>
+              <w:rPr>
+                <w:b/>
+                <w:bCs/>
+              </w:rPr>
+              <w:t>a</w:t>
+            </w:r>
+            <w:proofErr w:type="gramEnd"/>
+          </w:p>
+        </w:tc>
+        <w:tc>
+          <w:tcPr>
+            <w:tcW w:w="7560" w:type="dxa"/>
+            <w:tcBorders>
+              <w:top w:val="single" w:sz="4" w:space="0" w:color="BFBFBF"/>
+              <w:left w:val="single" w:sz="4" w:space="0" w:color="BFBFBF"/>
+              <w:bottom w:val="single" w:sz="4" w:space="0" w:color="BFBFBF"/>
+              <w:right w:val="single" w:sz="4" w:space="0" w:color="BFBFBF"/>
+            </w:tcBorders>
+            <w:tcMar>
+              <w:top w:w="100" w:type="dxa"/>
+              <w:left w:w="140" w:type="dxa"/>
+              <w:bottom w:w="100" w:type="dxa"/>
+              <w:right w:w="140" w:type="dxa"/>
+            </w:tcMar>
+          </w:tcPr>
+          <w:p/>
+          <w:p/>
+          <w:p/>
+        </w:tc>
+      </w:tr>
+      <w:tr>
+        <w:tc>
+          <w:tcPr>
+            <w:tcW w:w="1800" w:type="dxa"/>
+            <w:tcBorders>
+              <w:top w:val="single" w:sz="4" w:space="0" w:color="BFBFBF"/>
+              <w:left w:val="single" w:sz="4" w:space="0" w:color="BFBFBF"/>
+              <w:bottom w:val="single" w:sz="4" w:space="0" w:color="BFBFBF"/>
+              <w:right w:val="single" w:sz="4" w:space="0" w:color="BFBFBF"/>
+            </w:tcBorders>
+            <w:tcMar>
+              <w:top w:w="100" w:type="dxa"/>
+              <w:left w:w="140" w:type="dxa"/>
+              <w:bottom w:w="100" w:type="dxa"/>
+              <w:right w:w="140" w:type="dxa"/>
+            </w:tcMar>
+          </w:tcPr>
+          <w:p>
+            <w:r>
+              <w:rPr>
+                <w:b/>
+                <w:bCs/>
+              </w:rPr>
+              <w:t>Q</w:t>
+            </w:r>
+            <w:proofErr w:type="gramStart"/>
+            <w:r>
+              <w:rPr>
+                <w:b/>
+                <w:bCs/>
+              </w:rPr>
+              <w:t>1.</w:t>
+            </w:r>
+            <w:r>
+              <w:rPr>
+                <w:b/>
+                <w:bCs/>
+              </w:rPr>
+              <w:t>b</w:t>
+            </w:r>
+            <w:proofErr w:type="gramEnd"/>
+          </w:p>
+        </w:tc>
+        <w:tc>
+          <w:tcPr>
+            <w:tcW w:w="7560" w:type="dxa"/>
+            <w:tcBorders>
+              <w:top w:val="single" w:sz="4" w:space="0" w:color="BFBFBF"/>
+              <w:left w:val="single" w:sz="4" w:space="0" w:color="BFBFBF"/>
+              <w:bottom w:val="single" w:sz="4" w:space="0" w:color="BFBFBF"/>
+              <w:right w:val="single" w:sz="4" w:space="0" w:color="BFBFBF"/>
+            </w:tcBorders>
+            <w:tcMar>
+              <w:top w:w="100" w:type="dxa"/>
+              <w:left w:w="140" w:type="dxa"/>
+              <w:bottom w:w="100" w:type="dxa"/>
+              <w:right w:w="140" w:type="dxa"/>
+            </w:tcMar>
+          </w:tcPr>
+          <w:p/>
+          <w:p/>
+          <w:p/>
+        </w:tc>
+      </w:tr>
+      <w:tr>
+        <w:tc>
+          <w:tcPr>
+            <w:tcW w:w="1800" w:type="dxa"/>
+            <w:tcBorders>
+              <w:top w:val="single" w:sz="4" w:space="0" w:color="BFBFBF"/>
+              <w:left w:val="single" w:sz="4" w:space="0" w:color="BFBFBF"/>
+              <w:bottom w:val="single" w:sz="4" w:space="0" w:color="BFBFBF"/>
+              <w:right w:val="single" w:sz="4" w:space="0" w:color="BFBFBF"/>
+            </w:tcBorders>
+            <w:tcMar>
+              <w:top w:w="100" w:type="dxa"/>
+              <w:left w:w="140" w:type="dxa"/>
+              <w:bottom w:w="100" w:type="dxa"/>
+              <w:right w:w="140" w:type="dxa"/>
+            </w:tcMar>
+          </w:tcPr>
+          <w:p>
+            <w:r>
+              <w:rPr>
+                <w:b/>
+                <w:bCs/>
+              </w:rPr>
+              <w:t>Q1.</w:t>
+            </w:r>
+            <w:r>
+              <w:rPr>
+                <w:b/>
+                <w:bCs/>
+              </w:rPr>
+              <w:t>c</w:t>
+            </w:r>
+          </w:p>
+        </w:tc>
+        <w:tc>
+          <w:tcPr>
+            <w:tcW w:w="7560" w:type="dxa"/>
+            <w:tcBorders>
+              <w:top w:val="single" w:sz="4" w:space="0" w:color="BFBFBF"/>
+              <w:left w:val="single" w:sz="4" w:space="0" w:color="BFBFBF"/>
+              <w:bottom w:val="single" w:sz="4" w:space="0" w:color="BFBFBF"/>
+              <w:right w:val="single" w:sz="4" w:space="0" w:color="BFBFBF"/>
+            </w:tcBorders>
+            <w:tcMar>
+              <w:top w:w="100" w:type="dxa"/>
+              <w:left w:w="140" w:type="dxa"/>
+              <w:bottom w:w="100" w:type="dxa"/>
+              <w:right w:w="140" w:type="dxa"/>
+            </w:tcMar>
+          </w:tcPr>
+          <w:p/>
+          <w:p/>
+          <w:p/>
+        </w:tc>
+      </w:tr>
+      <w:tr>
+        <w:tc>
+          <w:tcPr>
+            <w:tcW w:w="1800" w:type="dxa"/>
+            <w:tcBorders>
+              <w:top w:val="single" w:sz="4" w:space="0" w:color="BFBFBF"/>
+              <w:left w:val="single" w:sz="4" w:space="0" w:color="BFBFBF"/>
+              <w:bottom w:val="single" w:sz="4" w:space="0" w:color="BFBFBF"/>
+              <w:right w:val="single" w:sz="4" w:space="0" w:color="BFBFBF"/>
+            </w:tcBorders>
+            <w:tcMar>
+              <w:top w:w="100" w:type="dxa"/>
+              <w:left w:w="140" w:type="dxa"/>
+              <w:bottom w:w="100" w:type="dxa"/>
+              <w:right w:w="140" w:type="dxa"/>
+            </w:tcMar>
+          </w:tcPr>
+          <w:p>
+            <w:r>
+              <w:rPr>
+                <w:b/>
+                <w:bCs/>
+              </w:rPr>
+              <w:t>Q</w:t>
+            </w:r>
+            <w:proofErr w:type="gramStart"/>
+            <w:r>
+              <w:rPr>
+                <w:b/>
+                <w:bCs/>
+              </w:rPr>
+              <w:t>2.a</w:t>
+            </w:r>
+            <w:proofErr w:type="gramEnd"/>
+          </w:p>
+        </w:tc>
+        <w:tc>
+          <w:tcPr>
+            <w:tcW w:w="7560" w:type="dxa"/>
+            <w:tcBorders>
+              <w:top w:val="single" w:sz="4" w:space="0" w:color="BFBFBF"/>
+              <w:left w:val="single" w:sz="4" w:space="0" w:color="BFBFBF"/>
+              <w:bottom w:val="single" w:sz="4" w:space="0" w:color="BFBFBF"/>
+              <w:right w:val="single" w:sz="4" w:space="0" w:color="BFBFBF"/>
+            </w:tcBorders>
+            <w:tcMar>
+              <w:top w:w="100" w:type="dxa"/>
+              <w:left w:w="140" w:type="dxa"/>
+              <w:bottom w:w="100" w:type="dxa"/>
+              <w:right w:w="140" w:type="dxa"/>
+            </w:tcMar>
+          </w:tcPr>
+          <w:p/>
+          <w:p/>
+          <w:p/>
+        </w:tc>
+      </w:tr>
+      <w:tr>
+        <w:tc>
+          <w:tcPr>
+            <w:tcW w:w="1800" w:type="dxa"/>
+            <w:tcBorders>
+              <w:top w:val="single" w:sz="4" w:space="0" w:color="BFBFBF"/>
+              <w:left w:val="single" w:sz="4" w:space="0" w:color="BFBFBF"/>
+              <w:bottom w:val="single" w:sz="4" w:space="0" w:color="BFBFBF"/>
+              <w:right w:val="single" w:sz="4" w:space="0" w:color="BFBFBF"/>
+            </w:tcBorders>
+            <w:tcMar>
+              <w:top w:w="100" w:type="dxa"/>
+              <w:left w:w="140" w:type="dxa"/>
+              <w:bottom w:w="100" w:type="dxa"/>
+              <w:right w:w="140" w:type="dxa"/>
+            </w:tcMar>
+          </w:tcPr>
+          <w:p>
+            <w:r>
+              <w:rPr>
+                <w:b/>
+                <w:bCs/>
+              </w:rPr>
+              <w:t>Q</w:t>
+            </w:r>
+            <w:proofErr w:type="gramStart"/>
+            <w:r>
+              <w:rPr>
+                <w:b/>
+                <w:bCs/>
+              </w:rPr>
+              <w:t>2.b</w:t>
+            </w:r>
+            <w:proofErr w:type="gramEnd"/>
+          </w:p>
+        </w:tc>
+        <w:tc>
+          <w:tcPr>
+            <w:tcW w:w="7560" w:type="dxa"/>
+            <w:tcBorders>
+              <w:top w:val="single" w:sz="4" w:space="0" w:color="BFBFBF"/>
+              <w:left w:val="single" w:sz="4" w:space="0" w:color="BFBFBF"/>
+              <w:bottom w:val="single" w:sz="4" w:space="0" w:color="BFBFBF"/>
+              <w:right w:val="single" w:sz="4" w:space="0" w:color="BFBFBF"/>
+            </w:tcBorders>
+            <w:tcMar>
+              <w:top w:w="100" w:type="dxa"/>
+              <w:left w:w="140" w:type="dxa"/>
+              <w:bottom w:w="100" w:type="dxa"/>
+              <w:right w:w="140" w:type="dxa"/>
+            </w:tcMar>
+          </w:tcPr>
+          <w:p/>
+          <w:p/>
+          <w:p/>
+        </w:tc>
+      </w:tr>
+      <w:tr>
+        <w:tc>
+          <w:tcPr>
+            <w:tcW w:w="1800" w:type="dxa"/>
+            <w:tcBorders>
+              <w:top w:val="single" w:sz="4" w:space="0" w:color="BFBFBF"/>
+              <w:left w:val="single" w:sz="4" w:space="0" w:color="BFBFBF"/>
+              <w:bottom w:val="single" w:sz="4" w:space="0" w:color="BFBFBF"/>
+              <w:right w:val="single" w:sz="4" w:space="0" w:color="BFBFBF"/>
+            </w:tcBorders>
+            <w:tcMar>
+              <w:top w:w="100" w:type="dxa"/>
+              <w:left w:w="140" w:type="dxa"/>
+              <w:bottom w:w="100" w:type="dxa"/>
+              <w:right w:w="140" w:type="dxa"/>
+            </w:tcMar>
+          </w:tcPr>
+          <w:p>
+            <w:r>
+              <w:rPr>
+                <w:b/>
+                <w:bCs/>
+              </w:rPr>
+              <w:t>Q</w:t>
+            </w:r>
+            <w:r>
+              <w:rPr>
+                <w:b/>
+                <w:bCs/>
+              </w:rPr>
+              <w:t>2.c</w:t>
             </w:r>
           </w:p>
         </w:tc>

</xml_diff>